<commit_message>
docs: change srs date to october second
</commit_message>
<xml_diff>
--- a/docs/part-1/VPS_SRS.docx
+++ b/docs/part-1/VPS_SRS.docx
@@ -268,7 +268,7 @@
           <w:sz w:val="28"/>
           <w:szCs w:val="28"/>
         </w:rPr>
-        <w:t>5 October 2026</w:t>
+        <w:t>2 October 2026</w:t>
       </w:r>
     </w:p>
     <w:p>
@@ -1064,7 +1064,7 @@
                 <w:rFonts w:ascii="Times New Roman" w:hAnsi="Times New Roman" w:cs="Times New Roman" w:eastAsia="Times New Roman"/>
                 <w:sz w:val="22"/>
               </w:rPr>
-              <w:t>05-10-2026</w:t>
+              <w:t>02-10-2026</w:t>
             </w:r>
           </w:p>
         </w:tc>
@@ -1889,7 +1889,7 @@
           <w:rFonts w:ascii="Times New Roman" w:hAnsi="Times New Roman" w:cs="Times New Roman" w:eastAsia="Times New Roman"/>
           <w:sz w:val="24"/>
         </w:rPr>
-        <w:t>VPS Software Test Plan, version 1.0, 05-10-2026 (docs/part-1 in the project repository).</w:t>
+        <w:t>VPS Software Test Plan, version 1.0 (docs/part-1 in the project repository).</w:t>
       </w:r>
     </w:p>
     <w:p>
@@ -1906,7 +1906,7 @@
           <w:rFonts w:ascii="Times New Roman" w:hAnsi="Times New Roman" w:cs="Times New Roman" w:eastAsia="Times New Roman"/>
           <w:sz w:val="24"/>
         </w:rPr>
-        <w:t>VPS Software Architecture and Design Specification, version 1.0, 05-10-2026 (same location).</w:t>
+        <w:t>VPS Software Architecture and Design Specification, version 1.0 (same location).</w:t>
       </w:r>
     </w:p>
     <w:p>

</xml_diff>

<commit_message>
docs: humanize prose in deliverables
</commit_message>
<xml_diff>
--- a/docs/part-1/VPS_SRS.docx
+++ b/docs/part-1/VPS_SRS.docx
@@ -1690,7 +1690,7 @@
           <w:rFonts w:ascii="Times New Roman" w:hAnsi="Times New Roman" w:cs="Times New Roman" w:eastAsia="Times New Roman"/>
           <w:sz w:val="24"/>
         </w:rPr>
-        <w:t>Many car parks still work on first come, first served: drivers circle looking for a bay, attendants keep paper logs, and nobody knows how full the car park will be in an hour. VPS lets a driver reserve a slot that suits their vehicle for a chosen time window, guarantees that no slot is promised to two drivers at once, and gives attendants a quick way to check vehicles in and out with correct charges.</w:t>
+        <w:t>Many car parks still allocate bays first come, first served, so drivers circle until they find one. Attendants keep paper logs, and nobody can tell how full the car park will be in an hour. VPS lets a driver reserve a slot that suits their vehicle for a chosen time window. No slot is ever promised to two drivers at once, and attendants get a quick way to check vehicles in and out with correct charges.</w:t>
       </w:r>
     </w:p>
     <w:p>
@@ -2029,7 +2029,7 @@
           <w:rFonts w:ascii="Times New Roman" w:hAnsi="Times New Roman" w:cs="Times New Roman" w:eastAsia="Times New Roman"/>
           <w:sz w:val="24"/>
         </w:rPr>
-        <w:t>VPS is a new, self-contained product. It does not replace an earlier system, although it replaces the paper logs and walk-up allocation that many car parks use today. It consists of a Django web application backed by PostgreSQL, a scheduler for time-based jobs, and a separate FastAPI service that serves availability forecasts. All users work through a web browser. The only external systems are an SMTP mail server for e-mail and, in deployment, an nginx reverse proxy that terminates TLS. The component structure is described in the Software Architecture and Design Specification.</w:t>
+        <w:t>VPS is a new, self-contained product that replaces the paper logs and walk-up allocation many car parks use today. It consists of a Django web application backed by PostgreSQL, a scheduler for time-based jobs, and a separate FastAPI service that serves availability forecasts. All users work through a web browser. The only external systems are an SMTP mail server for e-mail and, in deployment, an nginx reverse proxy that terminates TLS. The component structure is described in the Software Architecture and Design Specification.</w:t>
       </w:r>
     </w:p>
     <w:p>
@@ -2204,7 +2204,7 @@
           <w:rFonts w:ascii="Times New Roman" w:hAnsi="Times New Roman" w:cs="Times New Roman" w:eastAsia="Times New Roman"/>
           <w:sz w:val="24"/>
         </w:rPr>
-        <w:t xml:space="preserve"> (ALLOC): The system, not the Driver, chooses the slot.</w:t>
+        <w:t xml:space="preserve"> (ALLOC): The system chooses the slot; the Driver picks only the lot, vehicle and time window.</w:t>
       </w:r>
     </w:p>
     <w:p>
@@ -2335,22 +2335,24 @@
         <w:tblLook w:firstColumn="1" w:firstRow="1" w:lastColumn="0" w:lastRow="0" w:noHBand="0" w:noVBand="1" w:val="04A0"/>
       </w:tblPr>
       <w:tblGrid>
-        <w:gridCol w:w="1728"/>
+        <w:gridCol w:w="1584"/>
         <w:gridCol w:w="3311"/>
-        <w:gridCol w:w="3168"/>
-        <w:gridCol w:w="1152"/>
+        <w:gridCol w:w="3024"/>
+        <w:gridCol w:w="1440"/>
       </w:tblGrid>
       <w:tr>
         <w:trPr>
+          <w:cantSplit/>
           <w:tblHeader/>
         </w:trPr>
         <w:tc>
           <w:tcPr>
-            <w:tcW w:type="dxa" w:w="1728"/>
+            <w:tcW w:type="dxa" w:w="1584"/>
             <w:shd w:val="clear" w:color="auto" w:fill="D9E2F3"/>
           </w:tcPr>
           <w:p>
             <w:pPr>
+              <w:keepNext/>
               <w:spacing w:after="20" w:before="20"/>
               <w:jc w:val="left"/>
             </w:pPr>
@@ -2371,6 +2373,7 @@
           </w:tcPr>
           <w:p>
             <w:pPr>
+              <w:keepNext/>
               <w:spacing w:after="20" w:before="20"/>
               <w:jc w:val="left"/>
             </w:pPr>
@@ -2386,11 +2389,12 @@
         </w:tc>
         <w:tc>
           <w:tcPr>
-            <w:tcW w:type="dxa" w:w="3168"/>
+            <w:tcW w:type="dxa" w:w="3024"/>
             <w:shd w:val="clear" w:color="auto" w:fill="D9E2F3"/>
           </w:tcPr>
           <w:p>
             <w:pPr>
+              <w:keepNext/>
               <w:spacing w:after="20" w:before="20"/>
               <w:jc w:val="left"/>
             </w:pPr>
@@ -2406,11 +2410,12 @@
         </w:tc>
         <w:tc>
           <w:tcPr>
-            <w:tcW w:type="dxa" w:w="1152"/>
+            <w:tcW w:type="dxa" w:w="1440"/>
             <w:shd w:val="clear" w:color="auto" w:fill="D9E2F3"/>
           </w:tcPr>
           <w:p>
             <w:pPr>
+              <w:keepNext/>
               <w:spacing w:after="20" w:before="20"/>
               <w:jc w:val="left"/>
             </w:pPr>
@@ -2426,12 +2431,16 @@
         </w:tc>
       </w:tr>
       <w:tr>
-        <w:tc>
-          <w:tcPr>
-            <w:tcW w:type="dxa" w:w="1728"/>
-          </w:tcPr>
-          <w:p>
-            <w:pPr>
+        <w:trPr>
+          <w:cantSplit/>
+        </w:trPr>
+        <w:tc>
+          <w:tcPr>
+            <w:tcW w:type="dxa" w:w="1584"/>
+          </w:tcPr>
+          <w:p>
+            <w:pPr>
+              <w:keepNext/>
               <w:spacing w:after="20" w:before="20"/>
               <w:jc w:val="left"/>
             </w:pPr>
@@ -2450,6 +2459,7 @@
           </w:tcPr>
           <w:p>
             <w:pPr>
+              <w:keepNext/>
               <w:spacing w:after="20" w:before="20"/>
               <w:jc w:val="left"/>
             </w:pPr>
@@ -2464,10 +2474,11 @@
         </w:tc>
         <w:tc>
           <w:tcPr>
-            <w:tcW w:type="dxa" w:w="3168"/>
-          </w:tcPr>
-          <w:p>
-            <w:pPr>
+            <w:tcW w:type="dxa" w:w="3024"/>
+          </w:tcPr>
+          <w:p>
+            <w:pPr>
+              <w:keepNext/>
               <w:spacing w:after="20" w:before="20"/>
               <w:jc w:val="left"/>
             </w:pPr>
@@ -2482,10 +2493,11 @@
         </w:tc>
         <w:tc>
           <w:tcPr>
-            <w:tcW w:type="dxa" w:w="1152"/>
-          </w:tcPr>
-          <w:p>
-            <w:pPr>
+            <w:tcW w:type="dxa" w:w="1440"/>
+          </w:tcPr>
+          <w:p>
+            <w:pPr>
+              <w:keepNext/>
               <w:spacing w:after="20" w:before="20"/>
               <w:jc w:val="left"/>
             </w:pPr>
@@ -2500,12 +2512,16 @@
         </w:tc>
       </w:tr>
       <w:tr>
-        <w:tc>
-          <w:tcPr>
-            <w:tcW w:type="dxa" w:w="1728"/>
-          </w:tcPr>
-          <w:p>
-            <w:pPr>
+        <w:trPr>
+          <w:cantSplit/>
+        </w:trPr>
+        <w:tc>
+          <w:tcPr>
+            <w:tcW w:type="dxa" w:w="1584"/>
+          </w:tcPr>
+          <w:p>
+            <w:pPr>
+              <w:keepNext/>
               <w:spacing w:after="20" w:before="20"/>
               <w:jc w:val="left"/>
             </w:pPr>
@@ -2524,6 +2540,7 @@
           </w:tcPr>
           <w:p>
             <w:pPr>
+              <w:keepNext/>
               <w:spacing w:after="20" w:before="20"/>
               <w:jc w:val="left"/>
             </w:pPr>
@@ -2538,10 +2555,11 @@
         </w:tc>
         <w:tc>
           <w:tcPr>
-            <w:tcW w:type="dxa" w:w="3168"/>
-          </w:tcPr>
-          <w:p>
-            <w:pPr>
+            <w:tcW w:type="dxa" w:w="3024"/>
+          </w:tcPr>
+          <w:p>
+            <w:pPr>
+              <w:keepNext/>
               <w:spacing w:after="20" w:before="20"/>
               <w:jc w:val="left"/>
             </w:pPr>
@@ -2556,10 +2574,11 @@
         </w:tc>
         <w:tc>
           <w:tcPr>
-            <w:tcW w:type="dxa" w:w="1152"/>
-          </w:tcPr>
-          <w:p>
-            <w:pPr>
+            <w:tcW w:type="dxa" w:w="1440"/>
+          </w:tcPr>
+          <w:p>
+            <w:pPr>
+              <w:keepNext/>
               <w:spacing w:after="20" w:before="20"/>
               <w:jc w:val="left"/>
             </w:pPr>
@@ -2574,12 +2593,16 @@
         </w:tc>
       </w:tr>
       <w:tr>
-        <w:tc>
-          <w:tcPr>
-            <w:tcW w:type="dxa" w:w="1728"/>
-          </w:tcPr>
-          <w:p>
-            <w:pPr>
+        <w:trPr>
+          <w:cantSplit/>
+        </w:trPr>
+        <w:tc>
+          <w:tcPr>
+            <w:tcW w:type="dxa" w:w="1584"/>
+          </w:tcPr>
+          <w:p>
+            <w:pPr>
+              <w:keepNext/>
               <w:spacing w:after="20" w:before="20"/>
               <w:jc w:val="left"/>
             </w:pPr>
@@ -2598,6 +2621,7 @@
           </w:tcPr>
           <w:p>
             <w:pPr>
+              <w:keepNext/>
               <w:spacing w:after="20" w:before="20"/>
               <w:jc w:val="left"/>
             </w:pPr>
@@ -2612,10 +2636,11 @@
         </w:tc>
         <w:tc>
           <w:tcPr>
-            <w:tcW w:type="dxa" w:w="3168"/>
-          </w:tcPr>
-          <w:p>
-            <w:pPr>
+            <w:tcW w:type="dxa" w:w="3024"/>
+          </w:tcPr>
+          <w:p>
+            <w:pPr>
+              <w:keepNext/>
               <w:spacing w:after="20" w:before="20"/>
               <w:jc w:val="left"/>
             </w:pPr>
@@ -2630,10 +2655,11 @@
         </w:tc>
         <w:tc>
           <w:tcPr>
-            <w:tcW w:type="dxa" w:w="1152"/>
-          </w:tcPr>
-          <w:p>
-            <w:pPr>
+            <w:tcW w:type="dxa" w:w="1440"/>
+          </w:tcPr>
+          <w:p>
+            <w:pPr>
+              <w:keepNext/>
               <w:spacing w:after="20" w:before="20"/>
               <w:jc w:val="left"/>
             </w:pPr>
@@ -2648,9 +2674,12 @@
         </w:tc>
       </w:tr>
       <w:tr>
-        <w:tc>
-          <w:tcPr>
-            <w:tcW w:type="dxa" w:w="1728"/>
+        <w:trPr>
+          <w:cantSplit/>
+        </w:trPr>
+        <w:tc>
+          <w:tcPr>
+            <w:tcW w:type="dxa" w:w="1584"/>
           </w:tcPr>
           <w:p>
             <w:pPr>
@@ -2686,7 +2715,7 @@
         </w:tc>
         <w:tc>
           <w:tcPr>
-            <w:tcW w:type="dxa" w:w="3168"/>
+            <w:tcW w:type="dxa" w:w="3024"/>
           </w:tcPr>
           <w:p>
             <w:pPr>
@@ -2704,7 +2733,7 @@
         </w:tc>
         <w:tc>
           <w:tcPr>
-            <w:tcW w:type="dxa" w:w="1152"/>
+            <w:tcW w:type="dxa" w:w="1440"/>
           </w:tcPr>
           <w:p>
             <w:pPr>
@@ -6890,7 +6919,7 @@
           <w:rFonts w:ascii="Times New Roman" w:hAnsi="Times New Roman" w:cs="Times New Roman" w:eastAsia="Times New Roman"/>
           <w:sz w:val="24"/>
         </w:rPr>
-        <w:t xml:space="preserve">The system, not the Driver, chooses the slot. The rule is fixed and deterministic so that the same request on the same data always gives the same slot. Priority: </w:t>
+        <w:t xml:space="preserve">The system chooses the slot; the Driver picks only the lot, vehicle and time window. The rule is fixed and deterministic, so the same request on the same data always gives the same slot. Priority: </w:t>
       </w:r>
       <w:r>
         <w:rPr>

</xml_diff>